<commit_message>
deploy: publish verified application
</commit_message>
<xml_diff>
--- a/downloads/nagranie-piotr-2026-06-15/Kosmiczne-laboratorium-karta-sesji-studyjnej.docx
+++ b/downloads/nagranie-piotr-2026-06-15/Kosmiczne-laboratorium-karta-sesji-studyjnej.docx
@@ -62,7 +62,7 @@
           <w:b/>
           <w:color w:val="8B1C1C"/>
         </w:rPr>
-        <w:t xml:space="preserve">DRAFT / UNLOCKED · 2b1fe0fd882ab774 · NIE NAGRYWAĆ</w:t>
+        <w:t xml:space="preserve">DRAFT / UNLOCKED · d4e3485822e7e877 · NIE NAGRYWAĆ</w:t>
       </w:r>
     </w:p>
     <w:p>
@@ -78,7 +78,7 @@
           <w:b/>
           <w:color w:val="1F4D78"/>
         </w:rPr>
-        <w:t xml:space="preserve">121 kwestii · Piotr 17 / 3:26 · Tomek 104 / 15:34</w:t>
+        <w:t xml:space="preserve">121 kwestii · Piotr 17 / 3:25 · Tomek 104 / 15:31</w:t>
       </w:r>
     </w:p>
     <w:p>
@@ -192,7 +192,7 @@
           <w:sz-cs w:val="22"/>
           <w:color w:val="17243A"/>
         </w:rPr>
-        <w:t xml:space="preserve">☐ Dokumenty aktorów i ta karta pokazują ten sam hash: 2b1fe0fd882ab774.</w:t>
+        <w:t xml:space="preserve">☐ Dokumenty aktorów i ta karta pokazują ten sam hash: d4e3485822e7e877.</w:t>
       </w:r>
     </w:p>
     <w:p>
@@ -307,7 +307,7 @@
           <w:sz-cs w:val="22"/>
           <w:color w:val="17243A"/>
         </w:rPr>
-        <w:t xml:space="preserve">☐ Przejścia między pracowniami · 12 kwestii · około 2:08 czystego audio · HOST-HOME-001–HOST-FINAL-001</w:t>
+        <w:t xml:space="preserve">☐ Przejścia między pracowniami · 12 kwestii · około 2:07 czystego audio · HOST-HOME-001–HOST-FINAL-001</w:t>
       </w:r>
     </w:p>
     <w:p>
@@ -492,7 +492,7 @@
           <w:sz-cs w:val="22"/>
           <w:color w:val="17243A"/>
         </w:rPr>
-        <w:t xml:space="preserve">☐ Fazy Księżyca · 9 kwestii · około 1:19 czystego audio · MOON-001–MOON-009</w:t>
+        <w:t xml:space="preserve">☐ Fazy Księżyca · 9 kwestii · około 1:18 czystego audio · MOON-001–MOON-009</w:t>
       </w:r>
     </w:p>
     <w:p>
@@ -520,7 +520,7 @@
           <w:sz-cs w:val="22"/>
           <w:color w:val="17243A"/>
         </w:rPr>
-        <w:t xml:space="preserve">☐ Prawdziwe misje kosmiczne · 34 kwestii · około 5:55 czystego audio · TOMEK-ASSIST-OPEN–ASSIST-033</w:t>
+        <w:t xml:space="preserve">☐ Prawdziwe misje kosmiczne · 34 kwestii · około 5:53 czystego audio · TOMEK-ASSIST-OPEN–ASSIST-033</w:t>
       </w:r>
     </w:p>
     <w:p>
@@ -702,7 +702,7 @@
           <w:sz-cs w:val="22"/>
           <w:color w:val="17243A"/>
         </w:rPr>
-        <w:t xml:space="preserve">☐ ASSIST-014 · Tomek Miller · Prawdziwe misje kosmiczne · 12.0–15.5 s</w:t>
+        <w:t xml:space="preserve">☐ ASSIST-014 · Tomek Miller · Prawdziwe misje kosmiczne · 11.0–14.5 s</w:t>
       </w:r>
     </w:p>
     <w:p>

</xml_diff>